<commit_message>
Tighten sourcing in the plain bulleted brief and round chart-read figures
Co-Authored-By: Claude Fable 5.1 <noreply@anthropic.com>
Claude-Session: https://claude.ai/code/session_01VKikRW5GBV3qSjTxYi5jff
</commit_message>
<xml_diff>
--- a/reports/College athletics brief (plain bullets).docx
+++ b/reports/College athletics brief (plain bullets).docx
@@ -32,9 +32,9 @@
           <w:sz w:val="20"/>
           <w:szCs w:val="20"/>
         </w:rPr>
-        <w:t xml:space="preserve">NIL didn't start this. In every year from 2015 to 2020, only 20 to 29 FBS schools covered their costs with the money they actually generated. The other 100 or so needed a check from campus. </w:t>
-      </w:r>
-      <w:hyperlink w:history="1" r:id="rIdilko0g2jt49hv6vv8imlr">
+        <w:t xml:space="preserve">NIL didn't start this. In every year from FY2015 to FY2020, only 20 to 29 FBS schools covered their expenses with the revenue they generated themselves. The other 100 or so (FBS had about 130 schools) needed a check from campus. </w:t>
+      </w:r>
+      <w:hyperlink w:history="1" r:id="rIdcfagw90oq6ktp6l6m8yl0">
         <w:r>
           <w:rPr>
             <w:rFonts w:ascii="Arial" w:cs="Arial" w:eastAsia="Arial" w:hAnsi="Arial"/>
@@ -61,9 +61,9 @@
           <w:sz w:val="20"/>
           <w:szCs w:val="20"/>
         </w:rPr>
-        <w:t xml:space="preserve">Go back further and it's the same story. From 2005 to 2019 the Power 5 median grew generated revenue 149% and grew expenses 159%. The money came in and went right back out. </w:t>
-      </w:r>
-      <w:hyperlink w:history="1" r:id="rIdeu7bbm01ywvjlzqdw4b5m">
+        <w:t xml:space="preserve">Go back further and it's the same story. From FY2005 to FY2019 the median Power 5 school grew generated revenue 149% and grew expenses 159%. The money came in and went right back out. </w:t>
+      </w:r>
+      <w:hyperlink w:history="1" r:id="rId6bpr7rfhys8ep3nazdefr">
         <w:r>
           <w:rPr>
             <w:rFonts w:ascii="Arial" w:cs="Arial" w:eastAsia="Arial" w:hAnsi="Arial"/>
@@ -90,9 +90,9 @@
           <w:sz w:val="20"/>
           <w:szCs w:val="20"/>
         </w:rPr>
-        <w:t xml:space="preserve">Three things ate the TV windfall: coaches, staff, and buildings. Football coaching pay at the Power 5 publics rose 93% after inflation from 2009 to 2018, and total staff pay with severance rose 76% to $1.21B. </w:t>
-      </w:r>
-      <w:hyperlink w:history="1" r:id="rIdcqgo-ek3ocf1lojx6qvpe">
+        <w:t xml:space="preserve">Three things ate the TV windfall: coaches, staff, and buildings. At 51 Power 5 public schools, football coaching pay rose 93% after inflation from FY2009 to FY2018, and total staff pay including severance rose 76% to $1.21B. </w:t>
+      </w:r>
+      <w:hyperlink w:history="1" r:id="rIdkthcqb4edc_cthgoyvvww">
         <w:r>
           <w:rPr>
             <w:rFonts w:ascii="Arial" w:cs="Arial" w:eastAsia="Arial" w:hAnsi="Arial"/>
@@ -119,9 +119,9 @@
           <w:sz w:val="20"/>
           <w:szCs w:val="20"/>
         </w:rPr>
-        <w:t xml:space="preserve">Non-coaching payroll at 48 Power 5 publics went from $454M to $767M between 2004 and 2014. That's the analysts, recruiting staff, and administrators nobody budgets for out loud. </w:t>
-      </w:r>
-      <w:hyperlink w:history="1" r:id="rId03x8l6nsetik-tyrsa674">
+        <w:t xml:space="preserve">Non-coaching payroll at 48 public Power 5 schools went from $454M to $767M between 2004 and 2014, up 69% after inflation. That's the analysts, recruiting staff, and administrators nobody budgets for out loud. </w:t>
+      </w:r>
+      <w:hyperlink w:history="1" r:id="rIdi7jpkbvi5pk9covwttoha">
         <w:r>
           <w:rPr>
             <w:rFonts w:ascii="Arial" w:cs="Arial" w:eastAsia="Arial" w:hAnsi="Arial"/>
@@ -148,9 +148,28 @@
           <w:sz w:val="20"/>
           <w:szCs w:val="20"/>
         </w:rPr>
-        <w:t xml:space="preserve">Facilities became the biggest expense line at Power 5 schools by 2019, and public FBS programs were carrying $9.2B in athletics debt with the Power 5 paying $578M a year just in debt service. </w:t>
-      </w:r>
-      <w:hyperlink w:history="1" r:id="rIdifru8xgrw3ztgntebqu5n">
+        <w:t xml:space="preserve">As of 2018, public FBS schools carried $9.2B in athletics debt, and the 52 Power 5 publics alone were paying $578M a year in debt service. </w:t>
+      </w:r>
+      <w:hyperlink w:history="1" r:id="rIdjkavi_y4qzpjxluonpil0">
+        <w:r>
+          <w:rPr>
+            <w:rFonts w:ascii="Arial" w:cs="Arial" w:eastAsia="Arial" w:hAnsi="Arial"/>
+            <w:sz w:val="20"/>
+            <w:szCs w:val="20"/>
+            <w:u w:val="single"/>
+          </w:rPr>
+          <w:t xml:space="preserve">Knight Commission, Nov 2020</w:t>
+        </w:r>
+      </w:hyperlink>
+      <w:r>
+        <w:rPr>
+          <w:rFonts w:ascii="Arial" w:cs="Arial" w:eastAsia="Arial" w:hAnsi="Arial"/>
+          <w:sz w:val="20"/>
+          <w:szCs w:val="20"/>
+        </w:rPr>
+        <w:t xml:space="preserve">. By FY2019 facilities were the single largest expense line at Power 5 schools, at over 19% of spending. </w:t>
+      </w:r>
+      <w:hyperlink w:history="1" r:id="rIdarj9jvhqcluaxlcmplhfc">
         <w:r>
           <w:rPr>
             <w:rFonts w:ascii="Arial" w:cs="Arial" w:eastAsia="Arial" w:hAnsi="Arial"/>
@@ -161,44 +180,25 @@
           <w:t xml:space="preserve">NCAA 2020</w:t>
         </w:r>
       </w:hyperlink>
-      <w:r>
-        <w:rPr>
-          <w:rFonts w:ascii="Arial" w:cs="Arial" w:eastAsia="Arial" w:hAnsi="Arial"/>
-          <w:sz w:val="20"/>
-          <w:szCs w:val="20"/>
-        </w:rPr>
-        <w:t xml:space="preserve">; </w:t>
-      </w:r>
-      <w:hyperlink w:history="1" r:id="rId68-sjezrrpk6ssjrobsac">
-        <w:r>
-          <w:rPr>
-            <w:rFonts w:ascii="Arial" w:cs="Arial" w:eastAsia="Arial" w:hAnsi="Arial"/>
-            <w:sz w:val="20"/>
-            <w:szCs w:val="20"/>
-            <w:u w:val="single"/>
-          </w:rPr>
-          <w:t xml:space="preserve">Knight Commission, Sept 2020</w:t>
-        </w:r>
-      </w:hyperlink>
-    </w:p>
-    <w:p>
-      <w:pPr>
-        <w:pStyle w:val="ListParagraph"/>
-        <w:numPr>
-          <w:ilvl w:val="0"/>
-          <w:numId w:val="2"/>
-        </w:numPr>
-        <w:spacing w:after="60"/>
-      </w:pPr>
-      <w:r>
-        <w:rPr>
-          <w:rFonts w:ascii="Arial" w:cs="Arial" w:eastAsia="Arial" w:hAnsi="Arial"/>
-          <w:sz w:val="20"/>
-          <w:szCs w:val="20"/>
-        </w:rPr>
-        <w:t xml:space="preserve">Dead money. Public FBS schools paid $533.6M to coaches they'd already fired between 2010 and early 2021. </w:t>
-      </w:r>
-      <w:hyperlink w:history="1" r:id="rIddjiz4phs9kdobdhhtpfhk">
+    </w:p>
+    <w:p>
+      <w:pPr>
+        <w:pStyle w:val="ListParagraph"/>
+        <w:numPr>
+          <w:ilvl w:val="0"/>
+          <w:numId w:val="2"/>
+        </w:numPr>
+        <w:spacing w:after="60"/>
+      </w:pPr>
+      <w:r>
+        <w:rPr>
+          <w:rFonts w:ascii="Arial" w:cs="Arial" w:eastAsia="Arial" w:hAnsi="Arial"/>
+          <w:sz w:val="20"/>
+          <w:szCs w:val="20"/>
+        </w:rPr>
+        <w:t xml:space="preserve">Dead money. Public FBS schools paid $533.6M to coaches they had already fired between 2010 and January 2021. </w:t>
+      </w:r>
+      <w:hyperlink w:history="1" r:id="rId-v_98nrxwygpdzj2i5hvo">
         <w:r>
           <w:rPr>
             <w:rFonts w:ascii="Arial" w:cs="Arial" w:eastAsia="Arial" w:hAnsi="Arial"/>
@@ -225,9 +225,9 @@
           <w:sz w:val="20"/>
           <w:szCs w:val="20"/>
         </w:rPr>
-        <w:t xml:space="preserve">Only football and men's basketball make money at the median. Every other sport loses money, and FBS schools have to carry at least 16 of them. </w:t>
-      </w:r>
-      <w:hyperlink w:history="1" r:id="rIdeej3iv2cefzs8wkbibdwq">
+        <w:t xml:space="preserve">Only football and men's basketball make money at the median. Every other sport loses money, and FBS schools have to sponsor at least 16 of them. </w:t>
+      </w:r>
+      <w:hyperlink w:history="1" r:id="rIdiszaepuom4mthb98imhqd">
         <w:r>
           <w:rPr>
             <w:rFonts w:ascii="Arial" w:cs="Arial" w:eastAsia="Arial" w:hAnsi="Arial"/>
@@ -254,9 +254,9 @@
           <w:sz w:val="20"/>
           <w:szCs w:val="20"/>
         </w:rPr>
-        <w:t xml:space="preserve">The real cause is incentives. No shareholders, no profit motive, so every new dollar gets spent on winning. Zimbalist put it plainly: there's no such discipline in college sports because they don't have stockholders. </w:t>
-      </w:r>
-      <w:hyperlink w:history="1" r:id="rIdkoccopu8uqykjjavnlhzu">
+        <w:t xml:space="preserve">The root cause is incentives. No shareholders, no profit motive, so every new dollar gets spent on winning. Andrew Zimbalist's line is that "there is no such discipline in college sports" because athletic departments "don't have stockholders." </w:t>
+      </w:r>
+      <w:hyperlink w:history="1" r:id="rIdr-tr1dcvldvnr_pugujhy">
         <w:r>
           <w:rPr>
             <w:rFonts w:ascii="Arial" w:cs="Arial" w:eastAsia="Arial" w:hAnsi="Arial"/>
@@ -283,9 +283,9 @@
           <w:sz w:val="20"/>
           <w:szCs w:val="20"/>
         </w:rPr>
-        <w:t xml:space="preserve">Someone always covers the gap. In FY2019, 44% of all NCAA athletics revenue ($8.3B) was allocated from institutions, state money, and student fees. </w:t>
-      </w:r>
-      <w:hyperlink w:history="1" r:id="rIdwhqzwppcbfl1yzwo7vhpw">
+        <w:t xml:space="preserve">Someone always covers the gap. In FY2019, across all three NCAA divisions, 44% of athletics revenue ($8.3B of $18.9B) was allocated from institutions, government, and student fees. </w:t>
+      </w:r>
+      <w:hyperlink w:history="1" r:id="rId8owpqkiwvpshxp9kp86pa">
         <w:r>
           <w:rPr>
             <w:rFonts w:ascii="Arial" w:cs="Arial" w:eastAsia="Arial" w:hAnsi="Arial"/>
@@ -327,9 +327,9 @@
           <w:sz w:val="20"/>
           <w:szCs w:val="20"/>
         </w:rPr>
-        <w:t xml:space="preserve">It's not a revenue problem at the top. Division I generated revenue grew 60% from 2015 to 2024 against 31% inflation. </w:t>
-      </w:r>
-      <w:hyperlink w:history="1" r:id="rIdqr1obwnyzdre9smofjskv">
+        <w:t xml:space="preserve">It's not a revenue problem at the top. Division I generated revenue grew 60% from 2014-15 to 2023-24 against 31% inflation. </w:t>
+      </w:r>
+      <w:hyperlink w:history="1" r:id="rId-xg6k6u-tvclik1whbvhd">
         <w:r>
           <w:rPr>
             <w:rFonts w:ascii="Arial" w:cs="Arial" w:eastAsia="Arial" w:hAnsi="Arial"/>
@@ -356,38 +356,38 @@
           <w:sz w:val="20"/>
           <w:szCs w:val="20"/>
         </w:rPr>
-        <w:t xml:space="preserve">Total D-I revenue hit $20.5B in FY2024, up 7%. Spending hit $20.8B, up 9%. Revenue grows, spending grows faster, every year. </w:t>
-      </w:r>
-      <w:hyperlink w:history="1" r:id="rIdeuepjcufula635-d77dw8">
-        <w:r>
-          <w:rPr>
-            <w:rFonts w:ascii="Arial" w:cs="Arial" w:eastAsia="Arial" w:hAnsi="Arial"/>
-            <w:sz w:val="20"/>
-            <w:szCs w:val="20"/>
-            <w:u w:val="single"/>
-          </w:rPr>
-          <w:t xml:space="preserve">NCAA 10-year trends, Dec 2025</w:t>
-        </w:r>
-      </w:hyperlink>
-    </w:p>
-    <w:p>
-      <w:pPr>
-        <w:pStyle w:val="ListParagraph"/>
-        <w:numPr>
-          <w:ilvl w:val="0"/>
-          <w:numId w:val="2"/>
-        </w:numPr>
-        <w:spacing w:after="60"/>
-      </w:pPr>
-      <w:r>
-        <w:rPr>
-          <w:rFonts w:ascii="Arial" w:cs="Arial" w:eastAsia="Arial" w:hAnsi="Arial"/>
-          <w:sz w:val="20"/>
-          <w:szCs w:val="20"/>
-        </w:rPr>
-        <w:t xml:space="preserve">Power schools: generated revenue up 56% over ten years, expenses up 81%. Group of Five: up 35% vs up 51%. The median Power school still ran a $15M deficit on generated revenue in FY2024. </w:t>
-      </w:r>
-      <w:hyperlink w:history="1" r:id="rIdexg3magvbqhlgysjyvvyp">
+        <w:t xml:space="preserve">Total D-I revenue hit $20.5B in FY2024, up 7%. Spending hit $20.8B, up 9%. Revenue grows, spending grows faster. </w:t>
+      </w:r>
+      <w:hyperlink w:history="1" r:id="rIdnsaeq3lyzmtnf6gbdd78f">
+        <w:r>
+          <w:rPr>
+            <w:rFonts w:ascii="Arial" w:cs="Arial" w:eastAsia="Arial" w:hAnsi="Arial"/>
+            <w:sz w:val="20"/>
+            <w:szCs w:val="20"/>
+            <w:u w:val="single"/>
+          </w:rPr>
+          <w:t xml:space="preserve">NCAA 10-year trends, Dec 2025, pp. 12 and 20</w:t>
+        </w:r>
+      </w:hyperlink>
+    </w:p>
+    <w:p>
+      <w:pPr>
+        <w:pStyle w:val="ListParagraph"/>
+        <w:numPr>
+          <w:ilvl w:val="0"/>
+          <w:numId w:val="2"/>
+        </w:numPr>
+        <w:spacing w:after="60"/>
+      </w:pPr>
+      <w:r>
+        <w:rPr>
+          <w:rFonts w:ascii="Arial" w:cs="Arial" w:eastAsia="Arial" w:hAnsi="Arial"/>
+          <w:sz w:val="20"/>
+          <w:szCs w:val="20"/>
+        </w:rPr>
+        <w:t xml:space="preserve">Power schools: median generated revenue up 56% over ten years, median expenses up 81%. Group of Five: up 35% vs up 51%. The median Power school still ran a deficit of more than $15M on generated revenue in FY2024. </w:t>
+      </w:r>
+      <w:hyperlink w:history="1" r:id="rIdtitoz5myhjadwq3c9bmhi">
         <w:r>
           <w:rPr>
             <w:rFonts w:ascii="Arial" w:cs="Arial" w:eastAsia="Arial" w:hAnsi="Arial"/>
@@ -414,9 +414,28 @@
           <w:sz w:val="20"/>
           <w:szCs w:val="20"/>
         </w:rPr>
-        <w:t xml:space="preserve">The growth is TV and the playoff. Big Ten payouts went from $55.6M per school in FY2019 to about $76M in FY2025. </w:t>
-      </w:r>
-      <w:hyperlink w:history="1" r:id="rIdifffqbaxtgpudnfczhomt">
+        <w:t xml:space="preserve">The growth is TV and the playoff. Big Ten payouts went from about $55.6M per school in FY2019 </w:t>
+      </w:r>
+      <w:hyperlink w:history="1" r:id="rIdkrt6t9c2-4ihlqkgcs6qx">
+        <w:r>
+          <w:rPr>
+            <w:rFonts w:ascii="Arial" w:cs="Arial" w:eastAsia="Arial" w:hAnsi="Arial"/>
+            <w:sz w:val="20"/>
+            <w:szCs w:val="20"/>
+            <w:u w:val="single"/>
+          </w:rPr>
+          <w:t xml:space="preserve">NBC Sports, July 2020</w:t>
+        </w:r>
+      </w:hyperlink>
+      <w:r>
+        <w:rPr>
+          <w:rFonts w:ascii="Arial" w:cs="Arial" w:eastAsia="Arial" w:hAnsi="Arial"/>
+          <w:sz w:val="20"/>
+          <w:szCs w:val="20"/>
+        </w:rPr>
+        <w:t xml:space="preserve"> to $76.1M in FY2025 </w:t>
+      </w:r>
+      <w:hyperlink w:history="1" r:id="rIdqwdnxr7a2galu0k4cb8sh">
         <w:r>
           <w:rPr>
             <w:rFonts w:ascii="Arial" w:cs="Arial" w:eastAsia="Arial" w:hAnsi="Arial"/>
@@ -433,9 +452,28 @@
           <w:sz w:val="20"/>
           <w:szCs w:val="20"/>
         </w:rPr>
-        <w:t xml:space="preserve">. The SEC went from about $45M to $72.4M. </w:t>
-      </w:r>
-      <w:hyperlink w:history="1" r:id="rId2pabntvqwf2kjevqf3l2y">
+        <w:t xml:space="preserve">. The SEC went from about $45.3M </w:t>
+      </w:r>
+      <w:hyperlink w:history="1" r:id="rIdlw6ug9p-xe7fvgywhwweu">
+        <w:r>
+          <w:rPr>
+            <w:rFonts w:ascii="Arial" w:cs="Arial" w:eastAsia="Arial" w:hAnsi="Arial"/>
+            <w:sz w:val="20"/>
+            <w:szCs w:val="20"/>
+            <w:u w:val="single"/>
+          </w:rPr>
+          <w:t xml:space="preserve">Sports Business Daily, Jan 2020</w:t>
+        </w:r>
+      </w:hyperlink>
+      <w:r>
+        <w:rPr>
+          <w:rFonts w:ascii="Arial" w:cs="Arial" w:eastAsia="Arial" w:hAnsi="Arial"/>
+          <w:sz w:val="20"/>
+          <w:szCs w:val="20"/>
+        </w:rPr>
+        <w:t xml:space="preserve"> to $72.4M. </w:t>
+      </w:r>
+      <w:hyperlink w:history="1" r:id="rIdayr-atpldacurgjsrd6s-">
         <w:r>
           <w:rPr>
             <w:rFonts w:ascii="Arial" w:cs="Arial" w:eastAsia="Arial" w:hAnsi="Arial"/>
@@ -464,7 +502,7 @@
         </w:rPr>
         <w:t xml:space="preserve">The new CFP deal pays about $1.3B a year starting in 2026-27, roughly triple the old contract, and the SEC and Big Ten each take about 29% of it. </w:t>
       </w:r>
-      <w:hyperlink w:history="1" r:id="rIdizgqe9ubwoqca5gztnu8j">
+      <w:hyperlink w:history="1" r:id="rIdbvn9fpgekbrstmzitgtqy">
         <w:r>
           <w:rPr>
             <w:rFonts w:ascii="Arial" w:cs="Arial" w:eastAsia="Arial" w:hAnsi="Arial"/>
@@ -493,7 +531,7 @@
         </w:rPr>
         <w:t xml:space="preserve">After TV it's donors. Contributions and endowments are 26% of Power school revenue, second only to media and conference money at 31%. </w:t>
       </w:r>
-      <w:hyperlink w:history="1" r:id="rIdvscvdlvhprytw3coiqjlv">
+      <w:hyperlink w:history="1" r:id="rIdchzq8zrphaayxzdsxhspf">
         <w:r>
           <w:rPr>
             <w:rFonts w:ascii="Arial" w:cs="Arial" w:eastAsia="Arial" w:hAnsi="Arial"/>
@@ -520,9 +558,9 @@
           <w:sz w:val="20"/>
           <w:szCs w:val="20"/>
         </w:rPr>
-        <w:t xml:space="preserve">But it's concentrated. The 69 Power schools collect 77% of all generated revenue in Division I. Everybody else runs on campus money: institutional support is 41% of revenue at the Group of Five, 58% at FCS, and 64% at non-football D-I. </w:t>
-      </w:r>
-      <w:hyperlink w:history="1" r:id="rIdmtqehsksdykxrngko3wel">
+        <w:t xml:space="preserve">But it's concentrated. The 69 Power schools collect 77% of all generated revenue in Division I. Everybody else runs on campus money: institutional and government support is 41% of revenue at the Group of Five, 58% at FCS, and 64% at non-football D-I. </w:t>
+      </w:r>
+      <w:hyperlink w:history="1" r:id="rIdfvagxqtcvnooicggdmqwy">
         <w:r>
           <w:rPr>
             <w:rFonts w:ascii="Arial" w:cs="Arial" w:eastAsia="Arial" w:hAnsi="Arial"/>
@@ -549,9 +587,28 @@
           <w:sz w:val="20"/>
           <w:szCs w:val="20"/>
         </w:rPr>
-        <w:t xml:space="preserve">And the next TV cycle is expected to be more modest. The Big Ten deal ends in 2029-30 and the Big 12 in 2030-31, and the rights market is not what it was. </w:t>
-      </w:r>
-      <w:hyperlink w:history="1" r:id="rIdamtjlriuixlv1k4ftufkp">
+        <w:t xml:space="preserve">The next TV cycle is the open question. Media consultants Ed Desser and John Kosner estimate college football rights could grow from about $3.9B to about $8.4B a year by the SEC's next negotiation even without structural change, but they also note the big tech bidders haven't shown serious interest yet. </w:t>
+      </w:r>
+      <w:hyperlink w:history="1" r:id="rId5rmbyxwqqo5a3hmps0jkf">
+        <w:r>
+          <w:rPr>
+            <w:rFonts w:ascii="Arial" w:cs="Arial" w:eastAsia="Arial" w:hAnsi="Arial"/>
+            <w:sz w:val="20"/>
+            <w:szCs w:val="20"/>
+            <w:u w:val="single"/>
+          </w:rPr>
+          <w:t xml:space="preserve">Awful Announcing, April 2026</w:t>
+        </w:r>
+      </w:hyperlink>
+      <w:r>
+        <w:rPr>
+          <w:rFonts w:ascii="Arial" w:cs="Arial" w:eastAsia="Arial" w:hAnsi="Arial"/>
+          <w:sz w:val="20"/>
+          <w:szCs w:val="20"/>
+        </w:rPr>
+        <w:t xml:space="preserve">. Others expect more modest gains as cable shrinks. The Big Ten deal ends after 2029-30 and the Big 12 after 2030-31. </w:t>
+      </w:r>
+      <w:hyperlink w:history="1" r:id="rIdja8yvonbpyw6bozhunvm-">
         <w:r>
           <w:rPr>
             <w:rFonts w:ascii="Arial" w:cs="Arial" w:eastAsia="Arial" w:hAnsi="Arial"/>
@@ -578,9 +635,9 @@
           <w:sz w:val="20"/>
           <w:szCs w:val="20"/>
         </w:rPr>
-        <w:t xml:space="preserve">House added a brand new $20.5M line that goes up 4% a year. Year one got paid for with student fees (Clemson, $150 a semester), ticket surcharges (Tennessee, 10% talent fee), and internal loans (Kentucky, $141M). </w:t>
-      </w:r>
-      <w:hyperlink w:history="1" r:id="rIduwvckd2naq4kyeyxixw7n">
+        <w:t xml:space="preserve">House added a brand new $20.5M line that rises 4% a year. Year one got paid for with student fees (Clemson, $150 a semester), ticket surcharges (Tennessee, 10% talent fee), and internal loans (Kentucky, $141M from the university). </w:t>
+      </w:r>
+      <w:hyperlink w:history="1" r:id="rIdhxf17_qtjjpbdcqgjvuej">
         <w:r>
           <w:rPr>
             <w:rFonts w:ascii="Arial" w:cs="Arial" w:eastAsia="Arial" w:hAnsi="Arial"/>
@@ -599,7 +656,7 @@
         </w:rPr>
         <w:t xml:space="preserve">; </w:t>
       </w:r>
-      <w:hyperlink w:history="1" r:id="rIdysfejmctgdecciilxefdq">
+      <w:hyperlink w:history="1" r:id="rIdftwpx8mvfto5roip06bae">
         <w:r>
           <w:rPr>
             <w:rFonts w:ascii="Arial" w:cs="Arial" w:eastAsia="Arial" w:hAnsi="Arial"/>
@@ -618,7 +675,7 @@
         </w:rPr>
         <w:t xml:space="preserve">; </w:t>
       </w:r>
-      <w:hyperlink w:history="1" r:id="rId9xlprk642be_dovhcopeo">
+      <w:hyperlink w:history="1" r:id="rId38gjb7yalncj4ss7ngsrf">
         <w:r>
           <w:rPr>
             <w:rFonts w:ascii="Arial" w:cs="Arial" w:eastAsia="Arial" w:hAnsi="Arial"/>
@@ -637,7 +694,7 @@
         </w:rPr>
         <w:t xml:space="preserve">; </w:t>
       </w:r>
-      <w:hyperlink w:history="1" r:id="rIdl1yjaa8dtitcpdmlnfvfe">
+      <w:hyperlink w:history="1" r:id="rIdercffjg-o8bt_xjajqlmf">
         <w:r>
           <w:rPr>
             <w:rFonts w:ascii="Arial" w:cs="Arial" w:eastAsia="Arial" w:hAnsi="Arial"/>
@@ -664,9 +721,9 @@
           <w:sz w:val="20"/>
           <w:szCs w:val="20"/>
         </w:rPr>
-        <w:t xml:space="preserve">Cost-cutting is hard because most of the budget is already spoken for. At public FBS schools in FY2025, facilities and debt were 22% of spending, coaches 19%, non-coaching staff 16%, scholarships 14%. Call it close to 60% under contract. </w:t>
-      </w:r>
-      <w:hyperlink w:history="1" r:id="rIdcg1wv0u-berrdmdc0fvbh">
+        <w:t xml:space="preserve">Cost-cutting is hard because most of the budget is already spoken for. At public FBS schools in FY2025, facilities and debt service were 22% of spending, coaches 19%, non-coaching staff 16%, scholarships 14%. </w:t>
+      </w:r>
+      <w:hyperlink w:history="1" r:id="rId9zlqfr7cgc95npfhfxjvm">
         <w:r>
           <w:rPr>
             <w:rFonts w:ascii="Arial" w:cs="Arial" w:eastAsia="Arial" w:hAnsi="Arial"/>
@@ -677,25 +734,52 @@
           <w:t xml:space="preserve">Knight-Newhouse FY2025</w:t>
         </w:r>
       </w:hyperlink>
-    </w:p>
-    <w:p>
-      <w:pPr>
-        <w:pStyle w:val="ListParagraph"/>
-        <w:numPr>
-          <w:ilvl w:val="0"/>
-          <w:numId w:val="2"/>
-        </w:numPr>
-        <w:spacing w:after="60"/>
-      </w:pPr>
-      <w:r>
-        <w:rPr>
-          <w:rFonts w:ascii="Arial" w:cs="Arial" w:eastAsia="Arial" w:hAnsi="Arial"/>
-          <w:sz w:val="20"/>
-          <w:szCs w:val="20"/>
-        </w:rPr>
-        <w:t xml:space="preserve">The cuts that actually happen are tiny. Cal Poly dropped swimming to save about $450K. Kansas cut 8 to 10% of its staff and saved $3M. </w:t>
-      </w:r>
-      <w:hyperlink w:history="1" r:id="rIdlzduniohl_zle-cqidogg">
+      <w:r>
+        <w:rPr>
+          <w:rFonts w:ascii="Arial" w:cs="Arial" w:eastAsia="Arial" w:hAnsi="Arial"/>
+          <w:sz w:val="20"/>
+          <w:szCs w:val="20"/>
+        </w:rPr>
+        <w:t xml:space="preserve">. Add those up and roughly 55 to 60% is committed before the year starts (that's our math from the Knight categories, not a published figure).</w:t>
+      </w:r>
+    </w:p>
+    <w:p>
+      <w:pPr>
+        <w:pStyle w:val="ListParagraph"/>
+        <w:numPr>
+          <w:ilvl w:val="0"/>
+          <w:numId w:val="2"/>
+        </w:numPr>
+        <w:spacing w:after="60"/>
+      </w:pPr>
+      <w:r>
+        <w:rPr>
+          <w:rFonts w:ascii="Arial" w:cs="Arial" w:eastAsia="Arial" w:hAnsi="Arial"/>
+          <w:sz w:val="20"/>
+          <w:szCs w:val="20"/>
+        </w:rPr>
+        <w:t xml:space="preserve">The cuts that actually happen are tiny. Cal Poly dropped swimming and diving to save at least $450K a year. </w:t>
+      </w:r>
+      <w:hyperlink w:history="1" r:id="rIdhmmbc5ovhxw-xj5uqqucc">
+        <w:r>
+          <w:rPr>
+            <w:rFonts w:ascii="Arial" w:cs="Arial" w:eastAsia="Arial" w:hAnsi="Arial"/>
+            <w:sz w:val="20"/>
+            <w:szCs w:val="20"/>
+            <w:u w:val="single"/>
+          </w:rPr>
+          <w:t xml:space="preserve">ESPN, March 2025</w:t>
+        </w:r>
+      </w:hyperlink>
+      <w:r>
+        <w:rPr>
+          <w:rFonts w:ascii="Arial" w:cs="Arial" w:eastAsia="Arial" w:hAnsi="Arial"/>
+          <w:sz w:val="20"/>
+          <w:szCs w:val="20"/>
+        </w:rPr>
+        <w:t xml:space="preserve">. Kansas cut 8 to 10% of its staff and expects to save about $3M. </w:t>
+      </w:r>
+      <w:hyperlink w:history="1" r:id="rId1lesugf84c_ogdqobryz1">
         <w:r>
           <w:rPr>
             <w:rFonts w:ascii="Arial" w:cs="Arial" w:eastAsia="Arial" w:hAnsi="Arial"/>
@@ -714,7 +798,7 @@
         </w:rPr>
         <w:t xml:space="preserve">. Meanwhile football buyouts hit a record $228M in 2025. </w:t>
       </w:r>
-      <w:hyperlink w:history="1" r:id="rId1dykrby5w7c4nhje8lkra">
+      <w:hyperlink w:history="1" r:id="rIdp_rj6i-svvaj9zq5z7zzi">
         <w:r>
           <w:rPr>
             <w:rFonts w:ascii="Arial" w:cs="Arial" w:eastAsia="Arial" w:hAnsi="Arial"/>
@@ -741,38 +825,38 @@
           <w:sz w:val="20"/>
           <w:szCs w:val="20"/>
         </w:rPr>
-        <w:t xml:space="preserve">Try to cut big and you hit Title IX and the alumni. Stanford cut 11 sports in 2020 and reversed it in 2021 after the lawsuits and the donor revolt. </w:t>
-      </w:r>
-      <w:hyperlink w:history="1" r:id="rIdwbwfhcwxtpra1aljyxw98">
-        <w:r>
-          <w:rPr>
-            <w:rFonts w:ascii="Arial" w:cs="Arial" w:eastAsia="Arial" w:hAnsi="Arial"/>
-            <w:sz w:val="20"/>
-            <w:szCs w:val="20"/>
-            <w:u w:val="single"/>
-          </w:rPr>
-          <w:t xml:space="preserve">Sports Illustrated, Feb 2021</w:t>
-        </w:r>
-      </w:hyperlink>
-    </w:p>
-    <w:p>
-      <w:pPr>
-        <w:pStyle w:val="ListParagraph"/>
-        <w:numPr>
-          <w:ilvl w:val="0"/>
-          <w:numId w:val="2"/>
-        </w:numPr>
-        <w:spacing w:after="60"/>
-      </w:pPr>
-      <w:r>
-        <w:rPr>
-          <w:rFonts w:ascii="Arial" w:cs="Arial" w:eastAsia="Arial" w:hAnsi="Arial"/>
-          <w:sz w:val="20"/>
-          <w:szCs w:val="20"/>
-        </w:rPr>
-        <w:t xml:space="preserve">Matt Brown summed up the incentive problem: nobody gets promoted because of their financial restraint. </w:t>
-      </w:r>
-      <w:hyperlink w:history="1" r:id="rIdoh6ttfkxcbmzmhhz3xqju">
+        <w:t xml:space="preserve">Try to cut big and you hit Title IX and the alumni. Stanford announced in July 2020 it would cut 11 sports, then reversed in May 2021 after athletes sued and an alumni group organized. </w:t>
+      </w:r>
+      <w:hyperlink w:history="1" r:id="rIdzwrk5nscgqbgj4-bnmwt0">
+        <w:r>
+          <w:rPr>
+            <w:rFonts w:ascii="Arial" w:cs="Arial" w:eastAsia="Arial" w:hAnsi="Arial"/>
+            <w:sz w:val="20"/>
+            <w:szCs w:val="20"/>
+            <w:u w:val="single"/>
+          </w:rPr>
+          <w:t xml:space="preserve">KTVU, May 2021</w:t>
+        </w:r>
+      </w:hyperlink>
+    </w:p>
+    <w:p>
+      <w:pPr>
+        <w:pStyle w:val="ListParagraph"/>
+        <w:numPr>
+          <w:ilvl w:val="0"/>
+          <w:numId w:val="2"/>
+        </w:numPr>
+        <w:spacing w:after="60"/>
+      </w:pPr>
+      <w:r>
+        <w:rPr>
+          <w:rFonts w:ascii="Arial" w:cs="Arial" w:eastAsia="Arial" w:hAnsi="Arial"/>
+          <w:sz w:val="20"/>
+          <w:szCs w:val="20"/>
+        </w:rPr>
+        <w:t xml:space="preserve">Matt Brown summed up the incentive problem: "nobody gets promoted because of their financial restraint." </w:t>
+      </w:r>
+      <w:hyperlink w:history="1" r:id="rIdamkwkdxi-a2y1mfrrhoqc">
         <w:r>
           <w:rPr>
             <w:rFonts w:ascii="Arial" w:cs="Arial" w:eastAsia="Arial" w:hAnsi="Arial"/>
@@ -816,7 +900,7 @@
         </w:rPr>
         <w:t xml:space="preserve">First thing to know: nothing actually bans private capital. The Big Ten deal died on governance. UC Investments needed all 18 schools to say yes, Michigan and USC said no, and UC paused it on Nov 17, 2025. </w:t>
       </w:r>
-      <w:hyperlink w:history="1" r:id="rIddgamso52trp8v71kba3z1">
+      <w:hyperlink w:history="1" r:id="rId-_qjoq93ed97uaet8f_fq">
         <w:r>
           <w:rPr>
             <w:rFonts w:ascii="Arial" w:cs="Arial" w:eastAsia="Arial" w:hAnsi="Arial"/>
@@ -845,7 +929,7 @@
         </w:rPr>
         <w:t xml:space="preserve">The only deals that have closed are small. The Big 12 took a no-equity deal with RedBird and Weatherford that included a $30M credit line 13 of 16 schools turned down. </w:t>
       </w:r>
-      <w:hyperlink w:history="1" r:id="rId_r7a1_l410l1maaqf_ysj">
+      <w:hyperlink w:history="1" r:id="rIdmqjrv3dcjye0ms1sxvhq-">
         <w:r>
           <w:rPr>
             <w:rFonts w:ascii="Arial" w:cs="Arial" w:eastAsia="Arial" w:hAnsi="Arial"/>
@@ -862,9 +946,9 @@
           <w:sz w:val="20"/>
           <w:szCs w:val="20"/>
         </w:rPr>
-        <w:t xml:space="preserve">. Utah spun off its athletics into a company with Otro Capital and kept majority control. </w:t>
-      </w:r>
-      <w:hyperlink w:history="1" r:id="rIdfwkh1kzt_8edjjoicph3m">
+        <w:t xml:space="preserve">. Utah spun its athletics into a company with Otro Capital and kept majority control; terms weren't disclosed. </w:t>
+      </w:r>
+      <w:hyperlink w:history="1" r:id="rIdqpfgw8ngwdg3nu-iahknk">
         <w:r>
           <w:rPr>
             <w:rFonts w:ascii="Arial" w:cs="Arial" w:eastAsia="Arial" w:hAnsi="Arial"/>
@@ -893,7 +977,7 @@
         </w:rPr>
         <w:t xml:space="preserve">Congress is stuck. The SCORE Act got pulled from the House floor twice. </w:t>
       </w:r>
-      <w:hyperlink w:history="1" r:id="rIdmo21oj8v6jowsfyaxgyq0">
+      <w:hyperlink w:history="1" r:id="rId-ccap45a9q3dn0knxin8h">
         <w:r>
           <w:rPr>
             <w:rFonts w:ascii="Arial" w:cs="Arial" w:eastAsia="Arial" w:hAnsi="Arial"/>
@@ -912,7 +996,7 @@
         </w:rPr>
         <w:t xml:space="preserve">. The Senate passed the Protect College Sports Act 77-22 on Sept 28, 2026, but the House is in recess until after the midterms. </w:t>
       </w:r>
-      <w:hyperlink w:history="1" r:id="rIdsx0d0d_3zqdy5mhqlgybd">
+      <w:hyperlink w:history="1" r:id="rIdadxkuwf8b-3xsx1per4ut">
         <w:r>
           <w:rPr>
             <w:rFonts w:ascii="Arial" w:cs="Arial" w:eastAsia="Arial" w:hAnsi="Arial"/>
@@ -957,9 +1041,9 @@
           <w:sz w:val="20"/>
           <w:szCs w:val="20"/>
         </w:rPr>
-        <w:t xml:space="preserve">Campus money. Division I spent $20.8B against $13.1B generated and institutions covered $7.2B of the difference. General fund support at power schools nearly tripled from $445M to $1.2B between 2015 and 2024. </w:t>
-      </w:r>
-      <w:hyperlink w:history="1" r:id="rIdsy9ozwhfe7vbvju4uudtw">
+        <w:t xml:space="preserve">Campus money. Division I spent $20.8B against $13.1B generated in 2023-24 and institutions covered $7.2B of the difference. </w:t>
+      </w:r>
+      <w:hyperlink w:history="1" r:id="rIdb8ka9tb4lfvurenbtwwun">
         <w:r>
           <w:rPr>
             <w:rFonts w:ascii="Arial" w:cs="Arial" w:eastAsia="Arial" w:hAnsi="Arial"/>
@@ -976,191 +1060,256 @@
           <w:sz w:val="20"/>
           <w:szCs w:val="20"/>
         </w:rPr>
+        <w:t xml:space="preserve">. General fund support at power-conference schools nearly tripled from $445M to $1.2B between 2015 and 2024. </w:t>
+      </w:r>
+      <w:hyperlink w:history="1" r:id="rIdr7gbc5v3drm0hgriy4jgx">
+        <w:r>
+          <w:rPr>
+            <w:rFonts w:ascii="Arial" w:cs="Arial" w:eastAsia="Arial" w:hAnsi="Arial"/>
+            <w:sz w:val="20"/>
+            <w:szCs w:val="20"/>
+            <w:u w:val="single"/>
+          </w:rPr>
+          <w:t xml:space="preserve">Sen. Cantwell report, Sept 2026</w:t>
+        </w:r>
+      </w:hyperlink>
+    </w:p>
+    <w:p>
+      <w:pPr>
+        <w:pStyle w:val="ListParagraph"/>
+        <w:numPr>
+          <w:ilvl w:val="0"/>
+          <w:numId w:val="2"/>
+        </w:numPr>
+        <w:spacing w:after="60"/>
+      </w:pPr>
+      <w:r>
+        <w:rPr>
+          <w:rFonts w:ascii="Arial" w:cs="Arial" w:eastAsia="Arial" w:hAnsi="Arial"/>
+          <w:sz w:val="20"/>
+          <w:szCs w:val="20"/>
+        </w:rPr>
+        <w:t xml:space="preserve">Students. 87% of non-Power Four schools charge every student a mandatory athletics fee. </w:t>
+      </w:r>
+      <w:hyperlink w:history="1" r:id="rIdtm7aojthvdrflsh2yvku-">
+        <w:r>
+          <w:rPr>
+            <w:rFonts w:ascii="Arial" w:cs="Arial" w:eastAsia="Arial" w:hAnsi="Arial"/>
+            <w:sz w:val="20"/>
+            <w:szCs w:val="20"/>
+            <w:u w:val="single"/>
+          </w:rPr>
+          <w:t xml:space="preserve">Sen. Cantwell report, Sept 2026</w:t>
+        </w:r>
+      </w:hyperlink>
+      <w:r>
+        <w:rPr>
+          <w:rFonts w:ascii="Arial" w:cs="Arial" w:eastAsia="Arial" w:hAnsi="Arial"/>
+          <w:sz w:val="20"/>
+          <w:szCs w:val="20"/>
+        </w:rPr>
+        <w:t xml:space="preserve">. In Virginia the average is $1,967 per student and it's the fastest-rising line in the cost of attending a state school. </w:t>
+      </w:r>
+      <w:hyperlink w:history="1" r:id="rIdflnr70ns7yv7muwiakwsd">
+        <w:r>
+          <w:rPr>
+            <w:rFonts w:ascii="Arial" w:cs="Arial" w:eastAsia="Arial" w:hAnsi="Arial"/>
+            <w:sz w:val="20"/>
+            <w:szCs w:val="20"/>
+            <w:u w:val="single"/>
+          </w:rPr>
+          <w:t xml:space="preserve">Cardinal News, Aug 2026</w:t>
+        </w:r>
+      </w:hyperlink>
+    </w:p>
+    <w:p>
+      <w:pPr>
+        <w:pStyle w:val="ListParagraph"/>
+        <w:numPr>
+          <w:ilvl w:val="0"/>
+          <w:numId w:val="2"/>
+        </w:numPr>
+        <w:spacing w:after="60"/>
+      </w:pPr>
+      <w:r>
+        <w:rPr>
+          <w:rFonts w:ascii="Arial" w:cs="Arial" w:eastAsia="Arial" w:hAnsi="Arial"/>
+          <w:sz w:val="20"/>
+          <w:szCs w:val="20"/>
+        </w:rPr>
+        <w:t xml:space="preserve">States. Wisconsin is putting in $14.6M a year, Connecticut created a donor tax credit, New Jersey added $5M, Louisiana raised its sports betting tax with a share earmarked for athletics, and Florida is letting schools move auxiliary money through 2028. </w:t>
+      </w:r>
+      <w:hyperlink w:history="1" r:id="rIdyy5jeixw9okdx4mlf5shi">
+        <w:r>
+          <w:rPr>
+            <w:rFonts w:ascii="Arial" w:cs="Arial" w:eastAsia="Arial" w:hAnsi="Arial"/>
+            <w:sz w:val="20"/>
+            <w:szCs w:val="20"/>
+            <w:u w:val="single"/>
+          </w:rPr>
+          <w:t xml:space="preserve">Sen. Cantwell report, Sept 2026</w:t>
+        </w:r>
+      </w:hyperlink>
+    </w:p>
+    <w:p>
+      <w:pPr>
+        <w:pStyle w:val="ListParagraph"/>
+        <w:numPr>
+          <w:ilvl w:val="0"/>
+          <w:numId w:val="2"/>
+        </w:numPr>
+        <w:spacing w:after="60"/>
+      </w:pPr>
+      <w:r>
+        <w:rPr>
+          <w:rFonts w:ascii="Arial" w:cs="Arial" w:eastAsia="Arial" w:hAnsi="Arial"/>
+          <w:sz w:val="20"/>
+          <w:szCs w:val="20"/>
+        </w:rPr>
+        <w:t xml:space="preserve">Debt. Median Power Four athletics debt is $120.3M. Penn State is at $534.7M, Florida State $437M, and Cal is making payments until 2112. </w:t>
+      </w:r>
+      <w:hyperlink w:history="1" r:id="rIdueollpbj2bylcyd_akzlt">
+        <w:r>
+          <w:rPr>
+            <w:rFonts w:ascii="Arial" w:cs="Arial" w:eastAsia="Arial" w:hAnsi="Arial"/>
+            <w:sz w:val="20"/>
+            <w:szCs w:val="20"/>
+            <w:u w:val="single"/>
+          </w:rPr>
+          <w:t xml:space="preserve">Sen. Cantwell report, Sept 2026</w:t>
+        </w:r>
+      </w:hyperlink>
+    </w:p>
+    <w:p>
+      <w:pPr>
+        <w:pStyle w:val="ListParagraph"/>
+        <w:numPr>
+          <w:ilvl w:val="0"/>
+          <w:numId w:val="2"/>
+        </w:numPr>
+        <w:spacing w:after="60"/>
+      </w:pPr>
+      <w:r>
+        <w:rPr>
+          <w:rFonts w:ascii="Arial" w:cs="Arial" w:eastAsia="Arial" w:hAnsi="Arial"/>
+          <w:sz w:val="20"/>
+          <w:szCs w:val="20"/>
+        </w:rPr>
+        <w:t xml:space="preserve">Cuts at the bottom. More than 40 Division I Olympic sport programs were cut between May 2024 and July 2025, </w:t>
+      </w:r>
+      <w:hyperlink w:history="1" r:id="rIdogdk5lyfvomxk4xxq_goh">
+        <w:r>
+          <w:rPr>
+            <w:rFonts w:ascii="Arial" w:cs="Arial" w:eastAsia="Arial" w:hAnsi="Arial"/>
+            <w:sz w:val="20"/>
+            <w:szCs w:val="20"/>
+            <w:u w:val="single"/>
+          </w:rPr>
+          <w:t xml:space="preserve">Bloomberg Law</w:t>
+        </w:r>
+      </w:hyperlink>
+      <w:r>
+        <w:rPr>
+          <w:rFonts w:ascii="Arial" w:cs="Arial" w:eastAsia="Arial" w:hAnsi="Arial"/>
+          <w:sz w:val="20"/>
+          <w:szCs w:val="20"/>
+        </w:rPr>
+        <w:t xml:space="preserve"> and Saint Francis is moving its whole department down to Division III.</w:t>
+      </w:r>
+    </w:p>
+    <w:p>
+      <w:pPr>
+        <w:pStyle w:val="ListParagraph"/>
+        <w:numPr>
+          <w:ilvl w:val="0"/>
+          <w:numId w:val="2"/>
+        </w:numPr>
+        <w:spacing w:after="60"/>
+      </w:pPr>
+      <w:r>
+        <w:rPr>
+          <w:rFonts w:ascii="Arial" w:cs="Arial" w:eastAsia="Arial" w:hAnsi="Arial"/>
+          <w:sz w:val="20"/>
+          <w:szCs w:val="20"/>
+        </w:rPr>
+        <w:t xml:space="preserve">The NCAA's roughly $2.8B in House back damages gets paid over ten years. About $1.6B of it comes out of distributions to schools, and the NCAA's plan has the 27 non-power conferences bearing about 60% of that cost. </w:t>
+      </w:r>
+      <w:hyperlink w:history="1" r:id="rIdwvaxgxb6gwee847amqpvq">
+        <w:r>
+          <w:rPr>
+            <w:rFonts w:ascii="Arial" w:cs="Arial" w:eastAsia="Arial" w:hAnsi="Arial"/>
+            <w:sz w:val="20"/>
+            <w:szCs w:val="20"/>
+            <w:u w:val="single"/>
+          </w:rPr>
+          <w:t xml:space="preserve">ESPN, May 2024</w:t>
+        </w:r>
+      </w:hyperlink>
+      <w:r>
+        <w:rPr>
+          <w:rFonts w:ascii="Arial" w:cs="Arial" w:eastAsia="Arial" w:hAnsi="Arial"/>
+          <w:sz w:val="20"/>
+          <w:szCs w:val="20"/>
+        </w:rPr>
         <w:t xml:space="preserve">; </w:t>
       </w:r>
-      <w:hyperlink w:history="1" r:id="rIdm9aava1ir7xbcq7fo2xae">
-        <w:r>
-          <w:rPr>
-            <w:rFonts w:ascii="Arial" w:cs="Arial" w:eastAsia="Arial" w:hAnsi="Arial"/>
-            <w:sz w:val="20"/>
-            <w:szCs w:val="20"/>
-            <w:u w:val="single"/>
-          </w:rPr>
-          <w:t xml:space="preserve">Sen. Cantwell report, Sept 2026</w:t>
-        </w:r>
-      </w:hyperlink>
-    </w:p>
-    <w:p>
-      <w:pPr>
-        <w:pStyle w:val="ListParagraph"/>
-        <w:numPr>
-          <w:ilvl w:val="0"/>
-          <w:numId w:val="2"/>
-        </w:numPr>
-        <w:spacing w:after="60"/>
-      </w:pPr>
-      <w:r>
-        <w:rPr>
-          <w:rFonts w:ascii="Arial" w:cs="Arial" w:eastAsia="Arial" w:hAnsi="Arial"/>
-          <w:sz w:val="20"/>
-          <w:szCs w:val="20"/>
-        </w:rPr>
-        <w:t xml:space="preserve">Students. 87% of non-Power Four schools charge every student a mandatory athletics fee. Virginia's average is $1,967 per student and it's the fastest-rising part of tuition there. </w:t>
-      </w:r>
-      <w:hyperlink w:history="1" r:id="rIdqzyc9f3ijmanazvydfxqa">
-        <w:r>
-          <w:rPr>
-            <w:rFonts w:ascii="Arial" w:cs="Arial" w:eastAsia="Arial" w:hAnsi="Arial"/>
-            <w:sz w:val="20"/>
-            <w:szCs w:val="20"/>
-            <w:u w:val="single"/>
-          </w:rPr>
-          <w:t xml:space="preserve">Cardinal News, Aug 2026</w:t>
-        </w:r>
-      </w:hyperlink>
-    </w:p>
-    <w:p>
-      <w:pPr>
-        <w:pStyle w:val="ListParagraph"/>
-        <w:numPr>
-          <w:ilvl w:val="0"/>
-          <w:numId w:val="2"/>
-        </w:numPr>
-        <w:spacing w:after="60"/>
-      </w:pPr>
-      <w:r>
-        <w:rPr>
-          <w:rFonts w:ascii="Arial" w:cs="Arial" w:eastAsia="Arial" w:hAnsi="Arial"/>
-          <w:sz w:val="20"/>
-          <w:szCs w:val="20"/>
-        </w:rPr>
-        <w:t xml:space="preserve">States. Wisconsin is putting in $14.6M a year, Connecticut created a tax credit, New Jersey added $5M, Louisiana raised its sports betting tax for it, Florida is letting schools move auxiliary money. </w:t>
-      </w:r>
-      <w:hyperlink w:history="1" r:id="rIdbnvkb5sh9q1imnfmcogtr">
-        <w:r>
-          <w:rPr>
-            <w:rFonts w:ascii="Arial" w:cs="Arial" w:eastAsia="Arial" w:hAnsi="Arial"/>
-            <w:sz w:val="20"/>
-            <w:szCs w:val="20"/>
-            <w:u w:val="single"/>
-          </w:rPr>
-          <w:t xml:space="preserve">Sen. Cantwell report, Sept 2026</w:t>
-        </w:r>
-      </w:hyperlink>
-    </w:p>
-    <w:p>
-      <w:pPr>
-        <w:pStyle w:val="ListParagraph"/>
-        <w:numPr>
-          <w:ilvl w:val="0"/>
-          <w:numId w:val="2"/>
-        </w:numPr>
-        <w:spacing w:after="60"/>
-      </w:pPr>
-      <w:r>
-        <w:rPr>
-          <w:rFonts w:ascii="Arial" w:cs="Arial" w:eastAsia="Arial" w:hAnsi="Arial"/>
-          <w:sz w:val="20"/>
-          <w:szCs w:val="20"/>
-        </w:rPr>
-        <w:t xml:space="preserve">Debt. Median Power Four athletics debt is $120M. Penn State is at $535M, Florida State $437M, and Cal is making payments until 2112. </w:t>
-      </w:r>
-      <w:hyperlink w:history="1" r:id="rIdi1_86rjmadpfe7vynt2l3">
-        <w:r>
-          <w:rPr>
-            <w:rFonts w:ascii="Arial" w:cs="Arial" w:eastAsia="Arial" w:hAnsi="Arial"/>
-            <w:sz w:val="20"/>
-            <w:szCs w:val="20"/>
-            <w:u w:val="single"/>
-          </w:rPr>
-          <w:t xml:space="preserve">Sen. Cantwell report, Sept 2026</w:t>
-        </w:r>
-      </w:hyperlink>
-    </w:p>
-    <w:p>
-      <w:pPr>
-        <w:pStyle w:val="ListParagraph"/>
-        <w:numPr>
-          <w:ilvl w:val="0"/>
-          <w:numId w:val="2"/>
-        </w:numPr>
-        <w:spacing w:after="60"/>
-      </w:pPr>
-      <w:r>
-        <w:rPr>
-          <w:rFonts w:ascii="Arial" w:cs="Arial" w:eastAsia="Arial" w:hAnsi="Arial"/>
-          <w:sz w:val="20"/>
-          <w:szCs w:val="20"/>
-        </w:rPr>
-        <w:t xml:space="preserve">Cuts at the bottom. Somewhere between 30 and 40 Olympic sport programs were dropped in 2024-25 and Saint Francis left Division I entirely. </w:t>
-      </w:r>
-      <w:hyperlink w:history="1" r:id="rIdgra7uhbnkwdnzfrdfjwhn">
-        <w:r>
-          <w:rPr>
-            <w:rFonts w:ascii="Arial" w:cs="Arial" w:eastAsia="Arial" w:hAnsi="Arial"/>
-            <w:sz w:val="20"/>
-            <w:szCs w:val="20"/>
-            <w:u w:val="single"/>
-          </w:rPr>
-          <w:t xml:space="preserve">Bloomberg Law</w:t>
-        </w:r>
-      </w:hyperlink>
-    </w:p>
-    <w:p>
-      <w:pPr>
-        <w:pStyle w:val="ListParagraph"/>
-        <w:numPr>
-          <w:ilvl w:val="0"/>
-          <w:numId w:val="2"/>
-        </w:numPr>
-        <w:spacing w:after="60"/>
-      </w:pPr>
-      <w:r>
-        <w:rPr>
-          <w:rFonts w:ascii="Arial" w:cs="Arial" w:eastAsia="Arial" w:hAnsi="Arial"/>
-          <w:sz w:val="20"/>
-          <w:szCs w:val="20"/>
-        </w:rPr>
-        <w:t xml:space="preserve">The NCAA's $2.8B in back damages comes out of everyone's distributions for ten years, and the smaller leagues eat most of it. </w:t>
-      </w:r>
-      <w:hyperlink w:history="1" r:id="rIdu3l8tz82jlip0agzpfz3n">
-        <w:r>
-          <w:rPr>
-            <w:rFonts w:ascii="Arial" w:cs="Arial" w:eastAsia="Arial" w:hAnsi="Arial"/>
-            <w:sz w:val="20"/>
-            <w:szCs w:val="20"/>
-            <w:u w:val="single"/>
-          </w:rPr>
-          <w:t xml:space="preserve">Knight Commission brief, Feb 2025</w:t>
-        </w:r>
-      </w:hyperlink>
-    </w:p>
-    <w:p>
-      <w:pPr>
-        <w:pStyle w:val="ListParagraph"/>
-        <w:numPr>
-          <w:ilvl w:val="0"/>
-          <w:numId w:val="2"/>
-        </w:numPr>
-        <w:spacing w:after="60"/>
-      </w:pPr>
-      <w:r>
-        <w:rPr>
-          <w:rFonts w:ascii="Arial" w:cs="Arial" w:eastAsia="Arial" w:hAnsi="Arial"/>
-          <w:sz w:val="20"/>
-          <w:szCs w:val="20"/>
-        </w:rPr>
-        <w:t xml:space="preserve">The end state is tiering, not collapse. Only 68 of the 319 schools that opted into House actually spent to the $20.5M cap in year one. The Big Ten and SEC pull away, everyone else pays what they can afford and calls it a day. </w:t>
-      </w:r>
-      <w:hyperlink w:history="1" r:id="rIdztnzuldqp-gwct20odrwt">
-        <w:r>
-          <w:rPr>
-            <w:rFonts w:ascii="Arial" w:cs="Arial" w:eastAsia="Arial" w:hAnsi="Arial"/>
-            <w:sz w:val="20"/>
-            <w:szCs w:val="20"/>
-            <w:u w:val="single"/>
-          </w:rPr>
-          <w:t xml:space="preserve">College Sports Commission</w:t>
+      <w:hyperlink w:history="1" r:id="rIdqnck3hg9igx1440ccybho">
+        <w:r>
+          <w:rPr>
+            <w:rFonts w:ascii="Arial" w:cs="Arial" w:eastAsia="Arial" w:hAnsi="Arial"/>
+            <w:sz w:val="20"/>
+            <w:szCs w:val="20"/>
+            <w:u w:val="single"/>
+          </w:rPr>
+          <w:t xml:space="preserve">Front Office Sports, Aug 2024</w:t>
+        </w:r>
+      </w:hyperlink>
+    </w:p>
+    <w:p>
+      <w:pPr>
+        <w:pStyle w:val="ListParagraph"/>
+        <w:numPr>
+          <w:ilvl w:val="0"/>
+          <w:numId w:val="2"/>
+        </w:numPr>
+        <w:spacing w:after="60"/>
+      </w:pPr>
+      <w:r>
+        <w:rPr>
+          <w:rFonts w:ascii="Arial" w:cs="Arial" w:eastAsia="Arial" w:hAnsi="Arial"/>
+          <w:sz w:val="20"/>
+          <w:szCs w:val="20"/>
+        </w:rPr>
+        <w:t xml:space="preserve">The end state is tiering, not collapse. Of the 319 schools that opted into House, only 68 hit or came within 5% of the $20.5M cap in year one. The Big Ten and SEC pull away, everyone else pays what they can afford. </w:t>
+      </w:r>
+      <w:hyperlink w:history="1" r:id="rIdlu4jb8q7xwuim9d1lv9cj">
+        <w:r>
+          <w:rPr>
+            <w:rFonts w:ascii="Arial" w:cs="Arial" w:eastAsia="Arial" w:hAnsi="Arial"/>
+            <w:sz w:val="20"/>
+            <w:szCs w:val="20"/>
+            <w:u w:val="single"/>
+          </w:rPr>
+          <w:t xml:space="preserve">Bleacher Report, Oct 2026</w:t>
+        </w:r>
+      </w:hyperlink>
+      <w:r>
+        <w:rPr>
+          <w:rFonts w:ascii="Arial" w:cs="Arial" w:eastAsia="Arial" w:hAnsi="Arial"/>
+          <w:sz w:val="20"/>
+          <w:szCs w:val="20"/>
+        </w:rPr>
+        <w:t xml:space="preserve">; </w:t>
+      </w:r>
+      <w:hyperlink w:history="1" r:id="rId-i8qc8_vomh8j24dsik69">
+        <w:r>
+          <w:rPr>
+            <w:rFonts w:ascii="Arial" w:cs="Arial" w:eastAsia="Arial" w:hAnsi="Arial"/>
+            <w:sz w:val="20"/>
+            <w:szCs w:val="20"/>
+            <w:u w:val="single"/>
+          </w:rPr>
+          <w:t xml:space="preserve">AP, Oct 2026</w:t>
         </w:r>
       </w:hyperlink>
     </w:p>
@@ -1194,9 +1343,9 @@
           <w:sz w:val="20"/>
           <w:szCs w:val="20"/>
         </w:rPr>
-        <w:t xml:space="preserve">The deal: UC Investments offered $2.4B for 10% of "Big Ten Enterprises," a new company that would hold the league's media and sponsorship rights, with the grant of rights pushed from 2036 out to 2046. </w:t>
-      </w:r>
-      <w:hyperlink w:history="1" r:id="rIdz8g6v6w7df5i6wtmadwae">
+        <w:t xml:space="preserve">The deal: UC Investments offered about $2.4B for a 10% stake in "Big Ten Enterprises," a new entity that would hold the league's media and sponsorship rights, with the grant of rights pushed from 2036 out to 2046. </w:t>
+      </w:r>
+      <w:hyperlink w:history="1" r:id="rIdoy--mdivainizj0ixlkxs">
         <w:r>
           <w:rPr>
             <w:rFonts w:ascii="Arial" w:cs="Arial" w:eastAsia="Arial" w:hAnsi="Arial"/>
@@ -1223,9 +1372,9 @@
           <w:sz w:val="20"/>
           <w:szCs w:val="20"/>
         </w:rPr>
-        <w:t xml:space="preserve">Michigan was in the top tier at $190M up front, same as Ohio State and Penn State, with a bigger permanent share (5.5%) than everyone else. It said no anyway. That tells you it was never about the money. </w:t>
-      </w:r>
-      <w:hyperlink w:history="1" r:id="rIdlg3rqn85ohss4lcifvxj_">
+        <w:t xml:space="preserve">Michigan was in the top tier at $190M up front, same as Ohio State and Penn State, with a bigger permanent share (5.5%) than most of the league. It said no anyway. That tells you it was never about the money. </w:t>
+      </w:r>
+      <w:hyperlink w:history="1" r:id="rIdpcbpq2emwc8e7ef-2dxn5">
         <w:r>
           <w:rPr>
             <w:rFonts w:ascii="Arial" w:cs="Arial" w:eastAsia="Arial" w:hAnsi="Arial"/>
@@ -1244,7 +1393,7 @@
         </w:rPr>
         <w:t xml:space="preserve">; </w:t>
       </w:r>
-      <w:hyperlink w:history="1" r:id="rIdxlhaaegls6vgpqef72aki">
+      <w:hyperlink w:history="1" r:id="rIdcc6uaehc-7e6yogmw9q2w">
         <w:r>
           <w:rPr>
             <w:rFonts w:ascii="Arial" w:cs="Arial" w:eastAsia="Arial" w:hAnsi="Arial"/>
@@ -1273,7 +1422,7 @@
         </w:rPr>
         <w:t xml:space="preserve">Michigan's eight regents are elected statewide, so they answer to voters, not to the athletic director or the commissioner. They came out unanimously against it on Oct 16, 2025. </w:t>
       </w:r>
-      <w:hyperlink w:history="1" r:id="rId9r40s4fiui490wrdinpw_">
+      <w:hyperlink w:history="1" r:id="rIdccdtiyup12uicynrmmulp">
         <w:r>
           <w:rPr>
             <w:rFonts w:ascii="Arial" w:cs="Arial" w:eastAsia="Arial" w:hAnsi="Arial"/>
@@ -1300,9 +1449,9 @@
           <w:sz w:val="20"/>
           <w:szCs w:val="20"/>
         </w:rPr>
-        <w:t xml:space="preserve">Their words: Regent Bernstein called it "a very big payday loan" and "reckless and short-sighted." Regent Acker said "you can't borrow your way out of a spending problem." </w:t>
-      </w:r>
-      <w:hyperlink w:history="1" r:id="rIdgnzvxnwtowjnncxn5ol91">
+        <w:t xml:space="preserve">Their words: Regent Mark Bernstein called it "a very big payday loan" and "reckless and short-sighted." Regent Jordan Acker said "you can't borrow your way out of a spending problem." </w:t>
+      </w:r>
+      <w:hyperlink w:history="1" r:id="rIdqnam5-myw9is6bu7ispp2">
         <w:r>
           <w:rPr>
             <w:rFonts w:ascii="Arial" w:cs="Arial" w:eastAsia="Arial" w:hAnsi="Arial"/>
@@ -1329,9 +1478,9 @@
           <w:sz w:val="20"/>
           <w:szCs w:val="20"/>
         </w:rPr>
-        <w:t xml:space="preserve">The objections were structural: selling 10% of future revenue forever for one check, locking the league in until 2046, handing an outside investor a board seat, and doing the whole thing in secret. </w:t>
-      </w:r>
-      <w:hyperlink w:history="1" r:id="rIdg4sweodyykzfrcjjk5cam">
+        <w:t xml:space="preserve">The objections were structural: selling 10% of the league's commercial revenue to an outside investor for one check, locking the league in until 2046, giving that investor a board seat, and negotiating the whole thing in secret. </w:t>
+      </w:r>
+      <w:hyperlink w:history="1" r:id="rIdhkw2aqykstyf_dfayohm9">
         <w:r>
           <w:rPr>
             <w:rFonts w:ascii="Arial" w:cs="Arial" w:eastAsia="Arial" w:hAnsi="Arial"/>
@@ -1358,9 +1507,9 @@
           <w:sz w:val="20"/>
           <w:szCs w:val="20"/>
         </w:rPr>
-        <w:t xml:space="preserve">Then it got personal. Bernstein told the AP that Petitti tried to strong-arm Michigan with threats of penalties. The Big Ten denied it. </w:t>
-      </w:r>
-      <w:hyperlink w:history="1" r:id="rId3pbgp0f7r_jfenqqytuoi">
+        <w:t xml:space="preserve">Then it got personal. Bernstein told the AP that Commissioner Petitti tried to strong-arm Michigan with threats of penalties. The Big Ten denied it. </w:t>
+      </w:r>
+      <w:hyperlink w:history="1" r:id="rIdlyxu0gn99kd46ge5ew7v_">
         <w:r>
           <w:rPr>
             <w:rFonts w:ascii="Arial" w:cs="Arial" w:eastAsia="Arial" w:hAnsi="Arial"/>
@@ -1389,7 +1538,7 @@
         </w:rPr>
         <w:t xml:space="preserve">Warde Manuel framed it as control, not cash: night games, stadium ads, sponsorships, and a one-time infusion that doesn't fix anything. He also said Michigan didn't need the money. </w:t>
       </w:r>
-      <w:hyperlink w:history="1" r:id="rIda-om4dvxy4ovzp6ksbinl">
+      <w:hyperlink w:history="1" r:id="rIdiq1o51jtyki6ulgs-4dfx">
         <w:r>
           <w:rPr>
             <w:rFonts w:ascii="Arial" w:cs="Arial" w:eastAsia="Arial" w:hAnsi="Arial"/>
@@ -1416,38 +1565,57 @@
           <w:sz w:val="20"/>
           <w:szCs w:val="20"/>
         </w:rPr>
-        <w:t xml:space="preserve">Michigan can afford to say no. It covered its House gap with about $15M of university support and has the biggest brand in the league to fall back on. </w:t>
-      </w:r>
-      <w:hyperlink w:history="1" r:id="rIdkanivtnlchcjf2ncyx2ub">
-        <w:r>
-          <w:rPr>
-            <w:rFonts w:ascii="Arial" w:cs="Arial" w:eastAsia="Arial" w:hAnsi="Arial"/>
-            <w:sz w:val="20"/>
-            <w:szCs w:val="20"/>
-            <w:u w:val="single"/>
-          </w:rPr>
-          <w:t xml:space="preserve">Extra Points, Michigan finances</w:t>
-        </w:r>
-      </w:hyperlink>
-    </w:p>
-    <w:p>
-      <w:pPr>
-        <w:pStyle w:val="ListParagraph"/>
-        <w:numPr>
-          <w:ilvl w:val="0"/>
-          <w:numId w:val="2"/>
-        </w:numPr>
-        <w:spacing w:after="60"/>
-      </w:pPr>
-      <w:r>
-        <w:rPr>
-          <w:rFonts w:ascii="Arial" w:cs="Arial" w:eastAsia="Arial" w:hAnsi="Arial"/>
-          <w:sz w:val="20"/>
-          <w:szCs w:val="20"/>
-        </w:rPr>
-        <w:t xml:space="preserve">Penn State needed the money more. In the same quarter it owed James Franklin a $49M buyout, was mid-way through a $700M Beaver Stadium rebuild, and had $20.5M in House payments to make. </w:t>
-      </w:r>
-      <w:hyperlink w:history="1" r:id="rIdcc6nzxrzubyylpqpho36n">
+        <w:t xml:space="preserve">Michigan can afford to say no. It projected a shortfall of nearly $27M from House costs, trimmed it, and balanced its FY2026 budget with $15M of support from the university. </w:t>
+      </w:r>
+      <w:hyperlink w:history="1" r:id="rIdq1vsvcljl4o8u8_rlsqv2">
+        <w:r>
+          <w:rPr>
+            <w:rFonts w:ascii="Arial" w:cs="Arial" w:eastAsia="Arial" w:hAnsi="Arial"/>
+            <w:sz w:val="20"/>
+            <w:szCs w:val="20"/>
+            <w:u w:val="single"/>
+          </w:rPr>
+          <w:t xml:space="preserve">University Record, June 2025</w:t>
+        </w:r>
+      </w:hyperlink>
+    </w:p>
+    <w:p>
+      <w:pPr>
+        <w:pStyle w:val="ListParagraph"/>
+        <w:numPr>
+          <w:ilvl w:val="0"/>
+          <w:numId w:val="2"/>
+        </w:numPr>
+        <w:spacing w:after="60"/>
+      </w:pPr>
+      <w:r>
+        <w:rPr>
+          <w:rFonts w:ascii="Arial" w:cs="Arial" w:eastAsia="Arial" w:hAnsi="Arial"/>
+          <w:sz w:val="20"/>
+          <w:szCs w:val="20"/>
+        </w:rPr>
+        <w:t xml:space="preserve">Penn State needed the money more. In the same month it fired James Franklin and owed him more than $49M, </w:t>
+      </w:r>
+      <w:hyperlink w:history="1" r:id="rIditjvtsdvrnxtdwesivrvb">
+        <w:r>
+          <w:rPr>
+            <w:rFonts w:ascii="Arial" w:cs="Arial" w:eastAsia="Arial" w:hAnsi="Arial"/>
+            <w:sz w:val="20"/>
+            <w:szCs w:val="20"/>
+            <w:u w:val="single"/>
+          </w:rPr>
+          <w:t xml:space="preserve">ESPN, Oct 2025</w:t>
+        </w:r>
+      </w:hyperlink>
+      <w:r>
+        <w:rPr>
+          <w:rFonts w:ascii="Arial" w:cs="Arial" w:eastAsia="Arial" w:hAnsi="Arial"/>
+          <w:sz w:val="20"/>
+          <w:szCs w:val="20"/>
+        </w:rPr>
+        <w:t xml:space="preserve"> while in the middle of a $700M Beaver Stadium rebuild and paying $20.5M in House costs. </w:t>
+      </w:r>
+      <w:hyperlink w:history="1" r:id="rIdvbypzuyqjt2dbusrot8h4">
         <w:r>
           <w:rPr>
             <w:rFonts w:ascii="Arial" w:cs="Arial" w:eastAsia="Arial" w:hAnsi="Arial"/>
@@ -1476,7 +1644,7 @@
         </w:rPr>
         <w:t xml:space="preserve">Ohio State's president Ted Carter had already argued in September 2025 that "the biggest brands" deserve a bigger share, and the deal's 5.5% vs 4.9% split did exactly that. </w:t>
       </w:r>
-      <w:hyperlink w:history="1" r:id="rIdz7s8yzflre4ubqkoyydfx">
+      <w:hyperlink w:history="1" r:id="rIdjhfvkehneuo-civv5xjqv">
         <w:r>
           <w:rPr>
             <w:rFonts w:ascii="Arial" w:cs="Arial" w:eastAsia="Arial" w:hAnsi="Arial"/>
@@ -1503,9 +1671,9 @@
           <w:sz w:val="20"/>
           <w:szCs w:val="20"/>
         </w:rPr>
-        <w:t xml:space="preserve">One caveat worth keeping: neither Ohio State nor Penn State endorsed the deal on the record. Carter told the Columbus Dispatch they hadn't made a final decision. They were reported supporters, not declared ones. </w:t>
-      </w:r>
-      <w:hyperlink w:history="1" r:id="rIdxvt8u6sfltmedcwsjfma_">
+        <w:t xml:space="preserve">One caveat worth keeping: neither Ohio State nor Penn State endorsed the deal on the record. Carter told the Columbus Dispatch they had not made a final decision. They were reported supporters, not declared ones. </w:t>
+      </w:r>
+      <w:hyperlink w:history="1" r:id="rId1tcnvqjdvnpexzi1jjqts">
         <w:r>
           <w:rPr>
             <w:rFonts w:ascii="Arial" w:cs="Arial" w:eastAsia="Arial" w:hAnsi="Arial"/>
@@ -1534,7 +1702,7 @@
         </w:rPr>
         <w:t xml:space="preserve">USC was the only other no, and its reason was different. It was getting less ($150M vs $190M) and said so. </w:t>
       </w:r>
-      <w:hyperlink w:history="1" r:id="rId32nwtcekggty9u3q53sdm">
+      <w:hyperlink w:history="1" r:id="rId4c2bhnmsxyxn79mrgv6a2">
         <w:r>
           <w:rPr>
             <w:rFonts w:ascii="Arial" w:cs="Arial" w:eastAsia="Arial" w:hAnsi="Arial"/>
@@ -1561,9 +1729,9 @@
           <w:sz w:val="20"/>
           <w:szCs w:val="20"/>
         </w:rPr>
-        <w:t xml:space="preserve">Where it stands: paused since Nov 17, 2025 and the regents reaffirmed the no on Nov 20. No vote, no revival, and no formal cancellation reported through October 2026. </w:t>
-      </w:r>
-      <w:hyperlink w:history="1" r:id="rIdod3fvbainftncmdmvj2nt">
+        <w:t xml:space="preserve">Where it stands: paused since Nov 17, 2025, and the regents reaffirmed the no on Nov 20. No vote, no revival, and no formal cancellation reported through October 2026. </w:t>
+      </w:r>
+      <w:hyperlink w:history="1" r:id="rIdvbtgig1cbfulrksbi3lam">
         <w:r>
           <w:rPr>
             <w:rFonts w:ascii="Arial" w:cs="Arial" w:eastAsia="Arial" w:hAnsi="Arial"/>

</xml_diff>